<commit_message>
docs(examples): expand run/paragraph showcases to full property coverage
run-showcase now exercises all 43 settable run properties (complex-script,
theme fonts, per-script language, run shading, hidden text, w14 effects) and
paragraph-showcase all 60 settable paragraph properties (run-level formatting,
fonts/theme, styles, shading variants, tabs, full markRPr, list numbering).
Both validate clean and were verified rendering in real Word.
</commit_message>
<xml_diff>
--- a/examples/word/paragraph-showcase.docx
+++ b/examples/word/paragraph-showcase.docx
@@ -293,6 +293,350 @@
       <w:r>
         <w:rPr/>
         <w:t xml:space="preserve">Outline level 1 (shows in document map)</w:t>
+      </w:r>
+    </w:p>
+    <w:p>
+      <w:pPr>
+        <w:spacing w:before="200"/>
+      </w:pPr>
+      <w:r>
+        <w:rPr>
+          <w:b/>
+          <w:color w:val="1F4E79"/>
+          <w:sz w:val="28"/>
+        </w:rPr>
+        <w:t xml:space="preserve">Paragraph strike &amp; underline</w:t>
+      </w:r>
+    </w:p>
+    <w:p>
+      <w:pPr/>
+      <w:r>
+        <w:rPr>
+          <w:strike/>
+        </w:rPr>
+        <w:t xml:space="preserve">Whole paragraph struck out</w:t>
+      </w:r>
+    </w:p>
+    <w:p>
+      <w:pPr/>
+      <w:r>
+        <w:rPr>
+          <w:u w:val="wave" w:color="FF0000"/>
+        </w:rPr>
+        <w:t xml:space="preserve">Underlined paragraph (red wave)</w:t>
+      </w:r>
+    </w:p>
+    <w:p>
+      <w:pPr>
+        <w:spacing w:before="200"/>
+      </w:pPr>
+      <w:r>
+        <w:rPr>
+          <w:b/>
+          <w:color w:val="1F4E79"/>
+          <w:sz w:val="28"/>
+        </w:rPr>
+        <w:t xml:space="preserve">Complex-script (cs)</w:t>
+      </w:r>
+    </w:p>
+    <w:p>
+      <w:pPr>
+        <w:bidi/>
+        <w:rPr>
+          <w:bCs/>
+          <w:iCs/>
+          <w:szCs w:val="28"/>
+          <w:rtl/>
+        </w:rPr>
+      </w:pPr>
+      <w:r>
+        <w:rPr>
+          <w:bCs/>
+          <w:iCs/>
+          <w:szCs w:val="28"/>
+          <w:rtl/>
+        </w:rPr>
+        <w:t xml:space="preserve">cs bold/italic/14pt + RTL</w:t>
+      </w:r>
+    </w:p>
+    <w:p>
+      <w:pPr>
+        <w:spacing w:before="200"/>
+      </w:pPr>
+      <w:r>
+        <w:rPr>
+          <w:b/>
+          <w:color w:val="1F4E79"/>
+          <w:sz w:val="28"/>
+        </w:rPr>
+        <w:t xml:space="preserve">Spacing &amp; pagination extras</w:t>
+      </w:r>
+    </w:p>
+    <w:p>
+      <w:pPr>
+        <w:contextualSpacing xmlns:w="http://schemas.openxmlformats.org/wordprocessingml/2006/main" w:val="1"/>
+      </w:pPr>
+      <w:r>
+        <w:rPr/>
+        <w:t xml:space="preserve">contextualSpacing (collapse between same-style paras)</w:t>
+      </w:r>
+    </w:p>
+    <w:p>
+      <w:pPr>
+        <w:spacing w:line="280" w:lineRule="atLeast"/>
+      </w:pPr>
+      <w:r>
+        <w:rPr/>
+        <w:t xml:space="preserve">lineSpacing 14pt, lineRule=atLeast</w:t>
+      </w:r>
+    </w:p>
+    <w:p>
+      <w:pPr>
+        <w:pageBreakBefore/>
+      </w:pPr>
+      <w:r>
+        <w:rPr/>
+        <w:t xml:space="preserve">pageBreakBefore</w:t>
+      </w:r>
+    </w:p>
+    <w:p>
+      <w:pPr>
+        <w:wordWrap xmlns:w="http://schemas.openxmlformats.org/wordprocessingml/2006/main" w:val="0"/>
+      </w:pPr>
+      <w:r>
+        <w:rPr/>
+        <w:t xml:space="preserve">wordWrap off (break long URLs anywhere)</w:t>
+      </w:r>
+    </w:p>
+    <w:p>
+      <w:pPr>
+        <w:spacing w:before="200"/>
+      </w:pPr>
+      <w:r>
+        <w:rPr>
+          <w:b/>
+          <w:color w:val="1F4E79"/>
+          <w:sz w:val="28"/>
+        </w:rPr>
+        <w:t xml:space="preserve">Chars-based indent</w:t>
+      </w:r>
+    </w:p>
+    <w:p>
+      <w:pPr>
+        <w:ind w:hangingChars="100" w:firstLineChars="200"/>
+      </w:pPr>
+      <w:r>
+        <w:rPr/>
+        <w:t xml:space="preserve">first-line 200 chars, hanging 100 chars</w:t>
+      </w:r>
+    </w:p>
+    <w:p>
+      <w:pPr>
+        <w:spacing w:before="200"/>
+      </w:pPr>
+      <w:r>
+        <w:rPr>
+          <w:b/>
+          <w:color w:val="1F4E79"/>
+          <w:sz w:val="28"/>
+        </w:rPr>
+        <w:t xml:space="preserve">Fonts (explicit &amp; theme)</w:t>
+      </w:r>
+    </w:p>
+    <w:p>
+      <w:pPr/>
+      <w:r>
+        <w:rPr>
+          <w:rFonts w:ascii="Times New Roman" w:hAnsi="Times New Roman" w:eastAsia="Times New Roman"/>
+        </w:rPr>
+        <w:t xml:space="preserve">font shorthand Times New Roman</w:t>
+      </w:r>
+    </w:p>
+    <w:p>
+      <w:pPr/>
+      <w:r>
+        <w:rPr>
+          <w:rFonts w:ascii="Calibri" w:hAnsi="Calibri" w:eastAsia="SimSun" w:cs="Arial"/>
+        </w:rPr>
+        <w:t xml:space="preserve">per-script latin/ea/cs</w:t>
+      </w:r>
+    </w:p>
+    <w:p>
+      <w:pPr/>
+      <w:r>
+        <w:rPr>
+          <w:rFonts w:asciiTheme="minorHAnsi" w:hAnsiTheme="minorHAnsi" w:eastAsiaTheme="minorEastAsia" w:cstheme="minorBidi"/>
+        </w:rPr>
+        <w:t xml:space="preserve">theme fonts</w:t>
+      </w:r>
+    </w:p>
+    <w:p>
+      <w:pPr>
+        <w:spacing w:before="200"/>
+      </w:pPr>
+      <w:r>
+        <w:rPr>
+          <w:b/>
+          <w:color w:val="1F4E79"/>
+          <w:sz w:val="28"/>
+        </w:rPr>
+        <w:t xml:space="preserve">Styles</w:t>
+      </w:r>
+    </w:p>
+    <w:p>
+      <w:pPr>
+        <w:pStyle w:val="Heading1"/>
+      </w:pPr>
+      <w:r>
+        <w:rPr/>
+        <w:t xml:space="preserve">Paragraph style Heading1</w:t>
+      </w:r>
+    </w:p>
+    <w:p>
+      <w:pPr>
+        <w:rPr>
+          <w:rStyle w:val="Emphasis"/>
+        </w:rPr>
+      </w:pPr>
+      <w:r>
+        <w:rPr>
+          <w:rStyle w:val="Emphasis"/>
+        </w:rPr>
+        <w:t xml:space="preserve">Character style on the run</w:t>
+      </w:r>
+    </w:p>
+    <w:p>
+      <w:pPr>
+        <w:spacing w:before="200"/>
+      </w:pPr>
+      <w:r>
+        <w:rPr>
+          <w:b/>
+          <w:color w:val="1F4E79"/>
+          <w:sz w:val="28"/>
+        </w:rPr>
+        <w:t xml:space="preserve">Shading variants</w:t>
+      </w:r>
+    </w:p>
+    <w:p>
+      <w:pPr>
+        <w:shd w:val="clear" w:fill="FFFF00"/>
+      </w:pPr>
+      <w:r>
+        <w:rPr/>
+        <w:t xml:space="preserve">shd shorthand (yellow)</w:t>
+      </w:r>
+    </w:p>
+    <w:p>
+      <w:pPr>
+        <w:shd xmlns:w="http://schemas.openxmlformats.org/wordprocessingml/2006/main" w:val="pct15" w:color="C00000" w:fill="DDEBF7"/>
+      </w:pPr>
+      <w:r>
+        <w:rPr/>
+        <w:t xml:space="preserve">pct15 pattern, blue fill, red pattern color</w:t>
+      </w:r>
+    </w:p>
+    <w:p>
+      <w:pPr>
+        <w:spacing w:before="200"/>
+      </w:pPr>
+      <w:r>
+        <w:rPr>
+          <w:b/>
+          <w:color w:val="1F4E79"/>
+          <w:sz w:val="28"/>
+        </w:rPr>
+        <w:t xml:space="preserve">Tab stops</w:t>
+      </w:r>
+    </w:p>
+    <w:p>
+      <w:pPr>
+        <w:tabs>
+          <w:tab w:val="left" w:pos="720"/>
+          <w:tab w:val="left" w:pos="1440"/>
+        </w:tabs>
+      </w:pPr>
+      <w:r>
+        <w:rPr/>
+        <w:t xml:space="preserve">Tabs at 720 and 1440 twips</w:t>
+      </w:r>
+    </w:p>
+    <w:p>
+      <w:pPr>
+        <w:spacing w:before="200"/>
+      </w:pPr>
+      <w:r>
+        <w:rPr>
+          <w:b/>
+          <w:color w:val="1F4E79"/>
+          <w:sz w:val="28"/>
+        </w:rPr>
+        <w:t xml:space="preserve">Paragraph-mark formatting (full markRPr)</w:t>
+      </w:r>
+    </w:p>
+    <w:p>
+      <w:pPr>
+        <w:rPr>
+          <w:rFonts w:ascii="Georgia" w:hAnsi="Georgia" w:eastAsia="SimSun" w:cs="Arial"/>
+          <w:i/>
+          <w:strike/>
+          <w:sz w:val="28"/>
+          <w:highlight w:val="yellow"/>
+          <w:u w:val="single"/>
+        </w:rPr>
+      </w:pPr>
+      <w:r>
+        <w:rPr/>
+        <w:t xml:space="preserve">mark: italic/strike/underline/size/highlight/fonts</w:t>
+      </w:r>
+    </w:p>
+    <w:p>
+      <w:pPr>
+        <w:spacing w:before="200"/>
+      </w:pPr>
+      <w:r>
+        <w:rPr>
+          <w:b/>
+          <w:color w:val="1F4E79"/>
+          <w:sz w:val="28"/>
+        </w:rPr>
+        <w:t xml:space="preserve">List numbering</w:t>
+      </w:r>
+    </w:p>
+    <w:p>
+      <w:pPr>
+        <w:numPr>
+          <w:ilvl w:val="0"/>
+          <w:numId w:val="1"/>
+        </w:numPr>
+      </w:pPr>
+      <w:r>
+        <w:rPr/>
+        <w:t xml:space="preserve">Bulleted item</w:t>
+      </w:r>
+    </w:p>
+    <w:p>
+      <w:pPr>
+        <w:numPr>
+          <w:ilvl w:val="0"/>
+          <w:numId w:val="2"/>
+        </w:numPr>
+      </w:pPr>
+      <w:r>
+        <w:rPr/>
+        <w:t xml:space="preserve">Ordered item starting at 5</w:t>
+      </w:r>
+    </w:p>
+    <w:p>
+      <w:pPr>
+        <w:numPr>
+          <w:ilvl w:val="0"/>
+          <w:numId w:val="1"/>
+        </w:numPr>
+      </w:pPr>
+      <w:r>
+        <w:rPr/>
+        <w:t xml:space="preserve">Explicit numId=1 level 0</w:t>
       </w:r>
     </w:p>
     <w:sectPr>
@@ -305,7 +649,182 @@
 </file>
 
 <file path=word/numbering.xml><?xml version="1.0" encoding="utf-8"?>
-<w:numbering xmlns:w="http://schemas.openxmlformats.org/wordprocessingml/2006/main"/>
+<w:numbering xmlns:w="http://schemas.openxmlformats.org/wordprocessingml/2006/main">
+  <w:abstractNum w:abstractNumId="0">
+    <w:multiLevelType w:val="hybridMultilevel"/>
+    <w:lvl w:ilvl="0">
+      <w:start w:val="1"/>
+      <w:numFmt w:val="bullet"/>
+      <w:lvlText w:val="•"/>
+      <w:lvlJc w:val="left"/>
+      <w:pPr>
+        <w:ind w:left="720" w:hanging="360"/>
+      </w:pPr>
+    </w:lvl>
+    <w:lvl w:ilvl="1">
+      <w:start w:val="1"/>
+      <w:numFmt w:val="bullet"/>
+      <w:lvlText w:val="◦"/>
+      <w:lvlJc w:val="left"/>
+      <w:pPr>
+        <w:ind w:left="1440" w:hanging="360"/>
+      </w:pPr>
+    </w:lvl>
+    <w:lvl w:ilvl="2">
+      <w:start w:val="1"/>
+      <w:numFmt w:val="bullet"/>
+      <w:lvlText w:val="▪"/>
+      <w:lvlJc w:val="left"/>
+      <w:pPr>
+        <w:ind w:left="2160" w:hanging="360"/>
+      </w:pPr>
+    </w:lvl>
+    <w:lvl w:ilvl="3">
+      <w:start w:val="1"/>
+      <w:numFmt w:val="bullet"/>
+      <w:lvlText w:val="•"/>
+      <w:lvlJc w:val="left"/>
+      <w:pPr>
+        <w:ind w:left="2880" w:hanging="360"/>
+      </w:pPr>
+    </w:lvl>
+    <w:lvl w:ilvl="4">
+      <w:start w:val="1"/>
+      <w:numFmt w:val="bullet"/>
+      <w:lvlText w:val="◦"/>
+      <w:lvlJc w:val="left"/>
+      <w:pPr>
+        <w:ind w:left="3600" w:hanging="360"/>
+      </w:pPr>
+    </w:lvl>
+    <w:lvl w:ilvl="5">
+      <w:start w:val="1"/>
+      <w:numFmt w:val="bullet"/>
+      <w:lvlText w:val="▪"/>
+      <w:lvlJc w:val="left"/>
+      <w:pPr>
+        <w:ind w:left="4320" w:hanging="360"/>
+      </w:pPr>
+    </w:lvl>
+    <w:lvl w:ilvl="6">
+      <w:start w:val="1"/>
+      <w:numFmt w:val="bullet"/>
+      <w:lvlText w:val="•"/>
+      <w:lvlJc w:val="left"/>
+      <w:pPr>
+        <w:ind w:left="5040" w:hanging="360"/>
+      </w:pPr>
+    </w:lvl>
+    <w:lvl w:ilvl="7">
+      <w:start w:val="1"/>
+      <w:numFmt w:val="bullet"/>
+      <w:lvlText w:val="◦"/>
+      <w:lvlJc w:val="left"/>
+      <w:pPr>
+        <w:ind w:left="5760" w:hanging="360"/>
+      </w:pPr>
+    </w:lvl>
+    <w:lvl w:ilvl="8">
+      <w:start w:val="1"/>
+      <w:numFmt w:val="bullet"/>
+      <w:lvlText w:val="▪"/>
+      <w:lvlJc w:val="left"/>
+      <w:pPr>
+        <w:ind w:left="6480" w:hanging="360"/>
+      </w:pPr>
+    </w:lvl>
+  </w:abstractNum>
+  <w:abstractNum w:abstractNumId="1">
+    <w:multiLevelType w:val="hybridMultilevel"/>
+    <w:lvl w:ilvl="0">
+      <w:start w:val="5"/>
+      <w:numFmt w:val="decimal"/>
+      <w:lvlText w:val="%1."/>
+      <w:lvlJc w:val="left"/>
+      <w:pPr>
+        <w:ind w:left="720" w:hanging="360"/>
+      </w:pPr>
+    </w:lvl>
+    <w:lvl w:ilvl="1">
+      <w:start w:val="1"/>
+      <w:numFmt w:val="lowerLetter"/>
+      <w:lvlText w:val="%2."/>
+      <w:lvlJc w:val="left"/>
+      <w:pPr>
+        <w:ind w:left="1440" w:hanging="360"/>
+      </w:pPr>
+    </w:lvl>
+    <w:lvl w:ilvl="2">
+      <w:start w:val="1"/>
+      <w:numFmt w:val="lowerRoman"/>
+      <w:lvlText w:val="%3."/>
+      <w:lvlJc w:val="left"/>
+      <w:pPr>
+        <w:ind w:left="2160" w:hanging="360"/>
+      </w:pPr>
+    </w:lvl>
+    <w:lvl w:ilvl="3">
+      <w:start w:val="1"/>
+      <w:numFmt w:val="decimal"/>
+      <w:lvlText w:val="%4."/>
+      <w:lvlJc w:val="left"/>
+      <w:pPr>
+        <w:ind w:left="2880" w:hanging="360"/>
+      </w:pPr>
+    </w:lvl>
+    <w:lvl w:ilvl="4">
+      <w:start w:val="1"/>
+      <w:numFmt w:val="lowerLetter"/>
+      <w:lvlText w:val="%5."/>
+      <w:lvlJc w:val="left"/>
+      <w:pPr>
+        <w:ind w:left="3600" w:hanging="360"/>
+      </w:pPr>
+    </w:lvl>
+    <w:lvl w:ilvl="5">
+      <w:start w:val="1"/>
+      <w:numFmt w:val="lowerRoman"/>
+      <w:lvlText w:val="%6."/>
+      <w:lvlJc w:val="left"/>
+      <w:pPr>
+        <w:ind w:left="4320" w:hanging="360"/>
+      </w:pPr>
+    </w:lvl>
+    <w:lvl w:ilvl="6">
+      <w:start w:val="1"/>
+      <w:numFmt w:val="decimal"/>
+      <w:lvlText w:val="%7."/>
+      <w:lvlJc w:val="left"/>
+      <w:pPr>
+        <w:ind w:left="5040" w:hanging="360"/>
+      </w:pPr>
+    </w:lvl>
+    <w:lvl w:ilvl="7">
+      <w:start w:val="1"/>
+      <w:numFmt w:val="lowerLetter"/>
+      <w:lvlText w:val="%8."/>
+      <w:lvlJc w:val="left"/>
+      <w:pPr>
+        <w:ind w:left="5760" w:hanging="360"/>
+      </w:pPr>
+    </w:lvl>
+    <w:lvl w:ilvl="8">
+      <w:start w:val="1"/>
+      <w:numFmt w:val="lowerRoman"/>
+      <w:lvlText w:val="%9."/>
+      <w:lvlJc w:val="left"/>
+      <w:pPr>
+        <w:ind w:left="6480" w:hanging="360"/>
+      </w:pPr>
+    </w:lvl>
+  </w:abstractNum>
+  <w:num w:numId="1">
+    <w:abstractNumId w:val="0"/>
+  </w:num>
+  <w:num w:numId="2">
+    <w:abstractNumId w:val="1"/>
+  </w:num>
+</w:numbering>
 </file>
 
 <file path=word/styles.xml><?xml version="1.0" encoding="utf-8"?>

</xml_diff>